<commit_message>
Atualizações - Projeto de Extensão V
</commit_message>
<xml_diff>
--- a/DocumentoSoftware/DocumentoSoftware.docx
+++ b/DocumentoSoftware/DocumentoSoftware.docx
@@ -6,6 +6,8 @@
       <w:pPr>
         <w:ind w:left="2832" w:firstLine="708"/>
       </w:pPr>
+      <w:bookmarkStart w:id="0" w:name="_GoBack"/>
+      <w:bookmarkEnd w:id="0"/>
     </w:p>
     <w:p>
       <w:pPr>
@@ -3146,6 +3148,7 @@
                                     <w:calendar w:val="gregorian"/>
                                   </w:date>
                                 </w:sdtPr>
+                                <w:sdtEndPr/>
                                 <w:sdtContent>
                                   <w:p>
                                     <w:pPr>
@@ -3349,6 +3352,7 @@
                                     <w:dataBinding w:prefixMappings="xmlns:ns0='http://purl.org/dc/elements/1.1/' xmlns:ns1='http://schemas.openxmlformats.org/package/2006/metadata/core-properties' " w:xpath="/ns1:coreProperties[1]/ns0:title[1]" w:storeItemID="{6C3C8BC8-F283-45AE-878A-BAB7291924A1}"/>
                                     <w:text/>
                                   </w:sdtPr>
+                                  <w:sdtEndPr/>
                                   <w:sdtContent>
                                     <w:r>
                                       <w:rPr>
@@ -3378,6 +3382,7 @@
                                   <w:dataBinding w:prefixMappings="xmlns:ns0='http://purl.org/dc/elements/1.1/' xmlns:ns1='http://schemas.openxmlformats.org/package/2006/metadata/core-properties' " w:xpath="/ns1:coreProperties[1]/ns0:subject[1]" w:storeItemID="{6C3C8BC8-F283-45AE-878A-BAB7291924A1}"/>
                                   <w:text/>
                                 </w:sdtPr>
+                                <w:sdtEndPr/>
                                 <w:sdtContent>
                                   <w:p>
                                     <w:pPr>
@@ -3416,10 +3421,10 @@
                                   <w:alias w:val="Autor"/>
                                   <w:tag w:val=""/>
                                   <w:id w:val="-1536112409"/>
-                                  <w:showingPlcHdr/>
                                   <w:dataBinding w:prefixMappings="xmlns:ns0='http://purl.org/dc/elements/1.1/' xmlns:ns1='http://schemas.openxmlformats.org/package/2006/metadata/core-properties' " w:xpath="/ns1:coreProperties[1]/ns0:creator[1]" w:storeItemID="{6C3C8BC8-F283-45AE-878A-BAB7291924A1}"/>
                                   <w:text/>
                                 </w:sdtPr>
+                                <w:sdtEndPr/>
                                 <w:sdtContent>
                                   <w:p>
                                     <w:pPr>
@@ -3437,7 +3442,7 @@
                                         <w:sz w:val="32"/>
                                         <w:szCs w:val="32"/>
                                       </w:rPr>
-                                      <w:t xml:space="preserve">     </w:t>
+                                      <w:t>CarlosAlexandre</w:t>
                                     </w:r>
                                   </w:p>
                                 </w:sdtContent>
@@ -3492,6 +3497,7 @@
                               <w:dataBinding w:prefixMappings="xmlns:ns0='http://purl.org/dc/elements/1.1/' xmlns:ns1='http://schemas.openxmlformats.org/package/2006/metadata/core-properties' " w:xpath="/ns1:coreProperties[1]/ns0:title[1]" w:storeItemID="{6C3C8BC8-F283-45AE-878A-BAB7291924A1}"/>
                               <w:text/>
                             </w:sdtPr>
+                            <w:sdtEndPr/>
                             <w:sdtContent>
                               <w:r>
                                 <w:rPr>
@@ -3521,6 +3527,7 @@
                             <w:dataBinding w:prefixMappings="xmlns:ns0='http://purl.org/dc/elements/1.1/' xmlns:ns1='http://schemas.openxmlformats.org/package/2006/metadata/core-properties' " w:xpath="/ns1:coreProperties[1]/ns0:subject[1]" w:storeItemID="{6C3C8BC8-F283-45AE-878A-BAB7291924A1}"/>
                             <w:text/>
                           </w:sdtPr>
+                          <w:sdtEndPr/>
                           <w:sdtContent>
                             <w:p>
                               <w:pPr>
@@ -3559,10 +3566,10 @@
                             <w:alias w:val="Autor"/>
                             <w:tag w:val=""/>
                             <w:id w:val="-1536112409"/>
-                            <w:showingPlcHdr/>
                             <w:dataBinding w:prefixMappings="xmlns:ns0='http://purl.org/dc/elements/1.1/' xmlns:ns1='http://schemas.openxmlformats.org/package/2006/metadata/core-properties' " w:xpath="/ns1:coreProperties[1]/ns0:creator[1]" w:storeItemID="{6C3C8BC8-F283-45AE-878A-BAB7291924A1}"/>
                             <w:text/>
                           </w:sdtPr>
+                          <w:sdtEndPr/>
                           <w:sdtContent>
                             <w:p>
                               <w:pPr>
@@ -3580,7 +3587,7 @@
                                   <w:sz w:val="32"/>
                                   <w:szCs w:val="32"/>
                                 </w:rPr>
-                                <w:t xml:space="preserve">     </w:t>
+                                <w:t>CarlosAlexandre</w:t>
                               </w:r>
                             </w:p>
                           </w:sdtContent>
@@ -8991,8 +8998,6 @@
           <w:u w:val="none"/>
         </w:rPr>
       </w:pPr>
-      <w:bookmarkStart w:id="0" w:name="_GoBack"/>
-      <w:bookmarkEnd w:id="0"/>
       <w:r>
         <w:rPr>
           <w:rStyle w:val="Hyperlink"/>
@@ -9055,8 +9060,10 @@
       <w:r>
         <w:rPr>
           <w:rStyle w:val="Hyperlink"/>
+          <w:noProof/>
           <w:sz w:val="32"/>
           <w:szCs w:val="32"/>
+          <w:lang w:eastAsia="pt-BR"/>
         </w:rPr>
         <w:drawing>
           <wp:inline distT="0" distB="0" distL="0" distR="0" wp14:anchorId="6D01D10D" wp14:editId="79BDD0B6">
@@ -9105,6 +9112,10 @@
         </w:rPr>
       </w:pPr>
       <w:r>
+        <w:rPr>
+          <w:noProof/>
+          <w:lang w:eastAsia="pt-BR"/>
+        </w:rPr>
         <w:drawing>
           <wp:inline distT="0" distB="0" distL="0" distR="0" wp14:anchorId="24DBDEB3" wp14:editId="21FB374B">
             <wp:extent cx="5612130" cy="3156585"/>
@@ -9154,8 +9165,10 @@
       <w:r>
         <w:rPr>
           <w:rStyle w:val="Hyperlink"/>
+          <w:noProof/>
           <w:sz w:val="32"/>
           <w:szCs w:val="32"/>
+          <w:lang w:eastAsia="pt-BR"/>
         </w:rPr>
         <w:drawing>
           <wp:inline distT="0" distB="0" distL="0" distR="0" wp14:anchorId="6D98B2C8" wp14:editId="160FA004">
@@ -9270,6 +9283,7 @@
         <w:docPartUnique/>
       </w:docPartObj>
     </w:sdtPr>
+    <w:sdtEndPr/>
     <w:sdtContent>
       <w:p>
         <w:pPr>
@@ -9289,7 +9303,7 @@
           <w:rPr>
             <w:noProof/>
           </w:rPr>
-          <w:t>21</w:t>
+          <w:t>5</w:t>
         </w:r>
         <w:r>
           <w:fldChar w:fldCharType="end"/>
@@ -13044,7 +13058,7 @@
   <a:extraClrSchemeLst/>
   <a:extLst>
     <a:ext uri="{05A4C25C-085E-4340-85A3-A5531E510DB2}">
-      <thm15:themeFamily xmlns:thm15="http://schemas.microsoft.com/office/thememl/2012/main" xmlns="" name="Office Theme" id="{62F939B6-93AF-4DB8-9C6B-D6C7DFDC589F}" vid="{4A3C46E8-61CC-4603-A589-7422A47A8E4A}"/>
+      <thm15:themeFamily xmlns="" xmlns:thm15="http://schemas.microsoft.com/office/thememl/2012/main" name="Office Theme" id="{62F939B6-93AF-4DB8-9C6B-D6C7DFDC589F}" vid="{4A3C46E8-61CC-4603-A589-7422A47A8E4A}"/>
     </a:ext>
   </a:extLst>
 </a:theme>

</xml_diff>